<commit_message>
Updated website & Uploaded docs
</commit_message>
<xml_diff>
--- a/Working in ICT/100721115_ICT40120_WICT_AT1.docx
+++ b/Working in ICT/100721115_ICT40120_WICT_AT1.docx
@@ -21,12 +21,12 @@
             <wp:extent cx="2192400" cy="1213200"/>
             <wp:effectExtent b="0" l="0" r="0" t="0"/>
             <wp:wrapNone/>
-            <wp:docPr id="5" name="image2.jpg"/>
+            <wp:docPr id="5" name="image1.jpg"/>
             <a:graphic>
               <a:graphicData uri="http://schemas.openxmlformats.org/drawingml/2006/picture">
                 <pic:pic>
                   <pic:nvPicPr>
-                    <pic:cNvPr id="0" name="image2.jpg"/>
+                    <pic:cNvPr id="0" name="image1.jpg"/>
                     <pic:cNvPicPr preferRelativeResize="0"/>
                   </pic:nvPicPr>
                   <pic:blipFill>
@@ -60,12 +60,12 @@
           <wp:inline distB="0" distT="0" distL="0" distR="0">
             <wp:extent cx="1328400" cy="536400"/>
             <wp:effectExtent b="0" l="0" r="0" t="0"/>
-            <wp:docPr descr="TAFE Victoria Logo and Holmesglen Logo" id="6" name="image1.png"/>
+            <wp:docPr descr="TAFE Victoria Logo and Holmesglen Logo" id="6" name="image2.png"/>
             <a:graphic>
               <a:graphicData uri="http://schemas.openxmlformats.org/drawingml/2006/picture">
                 <pic:pic>
                   <pic:nvPicPr>
-                    <pic:cNvPr descr="TAFE Victoria Logo and Holmesglen Logo" id="0" name="image1.png"/>
+                    <pic:cNvPr descr="TAFE Victoria Logo and Holmesglen Logo" id="0" name="image2.png"/>
                     <pic:cNvPicPr preferRelativeResize="0"/>
                   </pic:nvPicPr>
                   <pic:blipFill>
@@ -599,12 +599,12 @@
             <wp:extent cx="2192400" cy="1213200"/>
             <wp:effectExtent b="0" l="0" r="0" t="0"/>
             <wp:wrapNone/>
-            <wp:docPr id="4" name="image2.jpg"/>
+            <wp:docPr id="4" name="image1.jpg"/>
             <a:graphic>
               <a:graphicData uri="http://schemas.openxmlformats.org/drawingml/2006/picture">
                 <pic:pic>
                   <pic:nvPicPr>
-                    <pic:cNvPr id="0" name="image2.jpg"/>
+                    <pic:cNvPr id="0" name="image1.jpg"/>
                     <pic:cNvPicPr preferRelativeResize="0"/>
                   </pic:nvPicPr>
                   <pic:blipFill>
@@ -638,12 +638,12 @@
           <wp:inline distB="0" distT="0" distL="0" distR="0">
             <wp:extent cx="1328400" cy="536400"/>
             <wp:effectExtent b="0" l="0" r="0" t="0"/>
-            <wp:docPr descr="TAFE Victoria Logo and Holmesglen Logo" id="7" name="image1.png"/>
+            <wp:docPr descr="TAFE Victoria Logo and Holmesglen Logo" id="7" name="image2.png"/>
             <a:graphic>
               <a:graphicData uri="http://schemas.openxmlformats.org/drawingml/2006/picture">
                 <pic:pic>
                   <pic:nvPicPr>
-                    <pic:cNvPr descr="TAFE Victoria Logo and Holmesglen Logo" id="0" name="image1.png"/>
+                    <pic:cNvPr descr="TAFE Victoria Logo and Holmesglen Logo" id="0" name="image2.png"/>
                     <pic:cNvPicPr preferRelativeResize="0"/>
                   </pic:nvPicPr>
                   <pic:blipFill>

</xml_diff>